<commit_message>
Adiciona previa de DAX, quick measures, VAR/RETURN, bookmarks/botoes e Import x DirectQuery nas apostilas das Aulas 3, 6, 7, 10 e 13
</commit_message>
<xml_diff>
--- a/Aula 03 - 04-09-2026/Aula 3 - Apostila do Aluno.docx
+++ b/Aula 03 - 04-09-2026/Aula 3 - Apostila do Aluno.docx
@@ -82,6 +82,14 @@
       </w:pPr>
       <w:r>
         <w:t>Como criar uma coluna calculada e uma medida DAX simples.</w:t>
+      </w:r>
+    </w:p>
+    <w:p>
+      <w:pPr>
+        <w:pStyle w:val="ListBullet"/>
+      </w:pPr>
+      <w:r>
+        <w:t>A sintaxe básica de uma fórmula DAX antes de escrever a primeira.</w:t>
       </w:r>
     </w:p>
     <w:p>
@@ -255,6 +263,12 @@
           <w:color w:val="1F497D"/>
         </w:rPr>
         <w:t>4. Colunas calculadas e medidas</w:t>
+      </w:r>
+    </w:p>
+    <w:p>
+      <w:pPr/>
+      <w:r>
+        <w:t>Antes de mergulhar nos exemplos, vale saber a sintaxe básica do DAX (Data Analysis Expressions), a linguagem de fórmulas do Power BI, parecida com fórmulas do Excel: NomeDaMedida = FUNÇÃO(Tabela[Coluna]). A sintaxe completa é o tema da Aula 6 — por enquanto, usamos só o essencial.</w:t>
       </w:r>
     </w:p>
     <w:p>
@@ -644,6 +658,14 @@
     </w:p>
     <w:p>
       <w:pPr>
+        <w:pStyle w:val="ListNumber"/>
+      </w:pPr>
+      <w:r>
+        <w:t>Qual a sintaxe básica de uma fórmula DAX (ex.: com SUM)?</w:t>
+      </w:r>
+    </w:p>
+    <w:p>
+      <w:pPr>
         <w:pStyle w:val="Heading1"/>
       </w:pPr>
       <w:r>

</xml_diff>